<commit_message>
Publish aligned teaching resources
</commit_message>
<xml_diff>
--- a/resources/teacher/Small-Box-15-Period-Teaching-Program-v2.1-Network-Benchmark.docx
+++ b/resources/teacher/Small-Box-15-Period-Teaching-Program-v2.1-Network-Benchmark.docx
@@ -1,6 +1,6 @@
 
 <file path=word/document.xml><?xml version="1.0" encoding="utf-8"?>
-<w:document xmlns:wpc="http://schemas.microsoft.com/office/word/2010/wordprocessingCanvas" xmlns:cx="http://schemas.microsoft.com/office/drawing/2014/chartex" xmlns:cx1="http://schemas.microsoft.com/office/drawing/2015/9/8/chartex" xmlns:cx2="http://schemas.microsoft.com/office/drawing/2015/10/21/chartex" xmlns:cx3="http://schemas.microsoft.com/office/drawing/2016/5/9/chartex" xmlns:cx4="http://schemas.microsoft.com/office/drawing/2016/5/10/chartex" xmlns:cx5="http://schemas.microsoft.com/office/drawing/2016/5/11/chartex" xmlns:cx6="http://schemas.microsoft.com/office/drawing/2016/5/12/chartex" xmlns:cx7="http://schemas.microsoft.com/office/drawing/2016/5/13/chartex" xmlns:cx8="http://schemas.microsoft.com/office/drawing/2016/5/14/chartex" xmlns:mc="http://schemas.openxmlformats.org/markup-compatibility/2006" xmlns:aink="http://schemas.microsoft.com/office/drawing/2016/ink" xmlns:am3d="http://schemas.microsoft.com/office/drawing/2017/model3d" xmlns:o="urn:schemas-microsoft-com:office:office" xmlns:oel="http://schemas.microsoft.com/office/2019/extlst" xmlns:r="http://schemas.openxmlformats.org/officeDocument/2006/relationships" xmlns:m="http://schemas.openxmlformats.org/officeDocument/2006/math" xmlns:v="urn:schemas-microsoft-com:vml" xmlns:wp14="http://schemas.microsoft.com/office/word/2010/wordprocessingDrawing" xmlns:wp="http://schemas.openxmlformats.org/drawingml/2006/wordprocessingDrawing" xmlns:w10="urn:schemas-microsoft-com:office:word" xmlns:w="http://schemas.openxmlformats.org/wordprocessingml/2006/main" xmlns:w14="http://schemas.microsoft.com/office/word/2010/wordml" xmlns:w15="http://schemas.microsoft.com/office/word/2012/wordml" xmlns:w16cei="http://schemas.microsoft.com/office/word/2026/wordml/cei" xmlns:w16cex="http://schemas.microsoft.com/office/word/2018/wordml/cex" xmlns:w16cid="http://schemas.microsoft.com/office/word/2016/wordml/cid" xmlns:w16="http://schemas.microsoft.com/office/word/2018/wordml" xmlns:w16du="http://schemas.microsoft.com/office/word/2023/wordml/word16du" xmlns:w16sdtdh="http://schemas.microsoft.com/office/word/2020/wordml/sdtdatahash" xmlns:w16sdtfl="http://schemas.microsoft.com/office/word/2024/wordml/sdtformatlock" xmlns:w16se="http://schemas.microsoft.com/office/word/2015/wordml/symex" xmlns:wpg="http://schemas.microsoft.com/office/word/2010/wordprocessingGroup" xmlns:wpi="http://schemas.microsoft.com/office/word/2010/wordprocessingInk" xmlns:wne="http://schemas.microsoft.com/office/word/2006/wordml" xmlns:wps="http://schemas.microsoft.com/office/word/2010/wordprocessingShape" mc:Ignorable="w14 w15 w16se w16cid w16 w16cex w16sdtdh w16sdtfl w16du wp14">
+<w:document xmlns:wp14="http://schemas.microsoft.com/office/word/2010/wordprocessingDrawing" xmlns:w16du="http://schemas.microsoft.com/office/word/2023/wordml/word16du" xmlns:w16sdtfl="http://schemas.microsoft.com/office/word/2024/wordml/sdtformatlock" xmlns:w16sdtdh="http://schemas.microsoft.com/office/word/2020/wordml/sdtdatahash" xmlns:w16cex="http://schemas.microsoft.com/office/word/2018/wordml/cex" xmlns:w16="http://schemas.microsoft.com/office/word/2018/wordml" xmlns:w16cid="http://schemas.microsoft.com/office/word/2016/wordml/cid" xmlns:w16se="http://schemas.microsoft.com/office/word/2015/wordml/symex" xmlns:w15="http://schemas.microsoft.com/office/word/2012/wordml" xmlns:w14="http://schemas.microsoft.com/office/word/2010/wordml" xmlns:w="http://schemas.openxmlformats.org/wordprocessingml/2006/main" xmlns:mc="http://schemas.openxmlformats.org/markup-compatibility/2006" xmlns:r="http://schemas.openxmlformats.org/officeDocument/2006/relationships" mc:Ignorable="w14 w15 w16se w16cid w16 w16cex w16sdtdh w16sdtfl w16du wp14">
   <w:body>
     <w:p>
       <w:pPr>
@@ -2402,7 +2402,7 @@
                 <w:color w:val="FFFFFF"/>
                 <w:sz w:val="19"/>
               </w:rPr>
-              <w:t>Syllabus alignment</w:t>
+              <w:t>Syllabus content</w:t>
             </w:r>
           </w:p>
         </w:tc>
@@ -2430,7 +2430,7 @@
                 <w:color w:val="FFFFFF"/>
                 <w:sz w:val="19"/>
               </w:rPr>
-              <w:t>What the teacher checks</w:t>
+              <w:t>Evidence / outcomes</w:t>
             </w:r>
           </w:p>
         </w:tc>
@@ -2633,7 +2633,7 @@
                 <w:rFonts w:ascii="Aptos" w:hAnsi="Aptos"/>
                 <w:b/>
                 <w:color w:val="174829"/>
-                <w:sz w:val="18"/>
+                <w:sz w:val="19"/>
               </w:rPr>
               <w:t xml:space="preserve"> · INT5-DES-01, INT5-EVL-01, INT5-ENV-01</w:t>
             </w:r>
@@ -2866,7 +2866,7 @@
                 <w:rFonts w:ascii="Aptos" w:hAnsi="Aptos"/>
                 <w:b/>
                 <w:color w:val="174829"/>
-                <w:sz w:val="18"/>
+                <w:sz w:val="19"/>
               </w:rPr>
               <w:t xml:space="preserve"> · INT5-PRO-01, INT5-INP-01, INT5-USE-01</w:t>
             </w:r>
@@ -3105,7 +3105,7 @@
                 <w:rFonts w:ascii="Aptos" w:hAnsi="Aptos"/>
                 <w:b/>
                 <w:color w:val="174829"/>
-                <w:sz w:val="18"/>
+                <w:sz w:val="19"/>
               </w:rPr>
               <w:t xml:space="preserve"> · INT5-SAF-01</w:t>
             </w:r>
@@ -3285,7 +3285,7 @@
                 <w:rFonts w:ascii="Aptos" w:hAnsi="Aptos"/>
                 <w:b/>
                 <w:color w:val="174829"/>
-                <w:sz w:val="18"/>
+                <w:sz w:val="19"/>
               </w:rPr>
               <w:t xml:space="preserve"> · INT5-SAF-01</w:t>
             </w:r>
@@ -3465,7 +3465,7 @@
                 <w:rFonts w:ascii="Aptos" w:hAnsi="Aptos"/>
                 <w:b/>
                 <w:color w:val="174829"/>
-                <w:sz w:val="18"/>
+                <w:sz w:val="19"/>
               </w:rPr>
               <w:t xml:space="preserve"> · INT5-PRO-01, INT5-INP-01, INT5-USE-01</w:t>
             </w:r>
@@ -3698,7 +3698,7 @@
                 <w:rFonts w:ascii="Aptos" w:hAnsi="Aptos"/>
                 <w:b/>
                 <w:color w:val="174829"/>
-                <w:sz w:val="18"/>
+                <w:sz w:val="19"/>
               </w:rPr>
               <w:t xml:space="preserve"> · INT5-PRO-01, INT5-INP-01, INT5-USE-01</w:t>
             </w:r>
@@ -3931,7 +3931,7 @@
                 <w:rFonts w:ascii="Aptos" w:hAnsi="Aptos"/>
                 <w:b/>
                 <w:color w:val="174829"/>
-                <w:sz w:val="18"/>
+                <w:sz w:val="19"/>
               </w:rPr>
               <w:t xml:space="preserve"> · INT5-PRO-01, INT5-INP-01, INT5-USE-01</w:t>
             </w:r>
@@ -4170,7 +4170,7 @@
                 <w:rFonts w:ascii="Aptos" w:hAnsi="Aptos"/>
                 <w:b/>
                 <w:color w:val="174829"/>
-                <w:sz w:val="18"/>
+                <w:sz w:val="19"/>
               </w:rPr>
               <w:t xml:space="preserve"> · INT5-PRO-01, INT5-INP-01, INT5-USE-01</w:t>
             </w:r>
@@ -4350,7 +4350,7 @@
                 <w:rFonts w:ascii="Aptos" w:hAnsi="Aptos"/>
                 <w:b/>
                 <w:color w:val="174829"/>
-                <w:sz w:val="18"/>
+                <w:sz w:val="19"/>
               </w:rPr>
               <w:t xml:space="preserve"> · INT5-SAF-01</w:t>
             </w:r>
@@ -4530,7 +4530,7 @@
                 <w:rFonts w:ascii="Aptos" w:hAnsi="Aptos"/>
                 <w:b/>
                 <w:color w:val="174829"/>
-                <w:sz w:val="18"/>
+                <w:sz w:val="19"/>
               </w:rPr>
               <w:t xml:space="preserve"> · INT5-PRO-01, INT5-INP-01, INT5-USE-01</w:t>
             </w:r>
@@ -4792,7 +4792,7 @@
                 <w:color w:val="FFFFFF"/>
                 <w:sz w:val="19"/>
               </w:rPr>
-              <w:t>Syllabus alignment</w:t>
+              <w:t>Syllabus content</w:t>
             </w:r>
           </w:p>
         </w:tc>
@@ -4820,7 +4820,7 @@
                 <w:color w:val="FFFFFF"/>
                 <w:sz w:val="19"/>
               </w:rPr>
-              <w:t>What the teacher checks</w:t>
+              <w:t>Evidence / outcomes</w:t>
             </w:r>
           </w:p>
         </w:tc>
@@ -5023,7 +5023,7 @@
                 <w:rFonts w:ascii="Aptos" w:hAnsi="Aptos"/>
                 <w:b/>
                 <w:color w:val="174829"/>
-                <w:sz w:val="18"/>
+                <w:sz w:val="19"/>
               </w:rPr>
               <w:t xml:space="preserve"> · INT5-PRO-01, INT5-INP-01, INT5-USE-01</w:t>
             </w:r>
@@ -5256,7 +5256,7 @@
                 <w:rFonts w:ascii="Aptos" w:hAnsi="Aptos"/>
                 <w:b/>
                 <w:color w:val="174829"/>
-                <w:sz w:val="18"/>
+                <w:sz w:val="19"/>
               </w:rPr>
               <w:t xml:space="preserve"> · INT5-PRO-01, INT5-INP-01, INT5-USE-01</w:t>
             </w:r>
@@ -5495,7 +5495,7 @@
                 <w:rFonts w:ascii="Aptos" w:hAnsi="Aptos"/>
                 <w:b/>
                 <w:color w:val="174829"/>
-                <w:sz w:val="18"/>
+                <w:sz w:val="19"/>
               </w:rPr>
               <w:t xml:space="preserve"> · INT5-PRO-01, INT5-INP-01, INT5-USE-01</w:t>
             </w:r>
@@ -5675,7 +5675,7 @@
                 <w:rFonts w:ascii="Aptos" w:hAnsi="Aptos"/>
                 <w:b/>
                 <w:color w:val="174829"/>
-                <w:sz w:val="18"/>
+                <w:sz w:val="19"/>
               </w:rPr>
               <w:t xml:space="preserve"> · INT5-SAF-01</w:t>
             </w:r>
@@ -5855,7 +5855,7 @@
                 <w:rFonts w:ascii="Aptos" w:hAnsi="Aptos"/>
                 <w:b/>
                 <w:color w:val="174829"/>
-                <w:sz w:val="18"/>
+                <w:sz w:val="19"/>
               </w:rPr>
               <w:t xml:space="preserve"> · INT5-PRO-01, INT5-INP-01, INT5-USE-01</w:t>
             </w:r>

</xml_diff>